<commit_message>
Rewrite report in clear student English without changing results
</commit_message>
<xml_diff>
--- a/docs/Bloom_Filter_Report.docx
+++ b/docs/Bloom_Filter_Report.docx
@@ -920,7 +920,7 @@
         <w:pStyle w:val="Normal"/>
       </w:pPr>
       <w:r>
-        <w:t xml:space="preserve">This C++17 project studies an insertion-only Bloom filter. Choose parameters for the error target and total query cost: seven hashes gave about 0.82% false positives at 10 bits per key, while one hash gave higher exact throughput on tested miss-heavy workloads. Full scanning improved the seven-hash pipeline for all-absent queries but lost to early exit at 50% absent.</w:t>
+        <w:t xml:space="preserve">This project uses C++17 to implement a Bloom filter that supports insertion and lookup. The experiments compare its error rate, memory use and query time. The main finding is that fewer false positives do not always mean faster queries. With many queries for missing keys, using one hash was faster than using seven, even though seven gave a lower error rate.</w:t>
       </w:r>
     </w:p>
     <w:p>
@@ -928,7 +928,7 @@
         <w:pStyle w:val="Normal"/>
       </w:pPr>
       <w:r>
-        <w:t xml:space="preserve">The filter accepts unsigned 64-bit keys and stores bit markers, not the keys, in packed 64-bit words. Parameters are bit count m, hash count k and seed. insert adds markers; contains returns definitely absent or possibly present. Deletion, resizing, persistence and concurrent mutation are outside scope.</w:t>
+        <w:t xml:space="preserve">The filter takes unsigned 64-bit keys as input and stores their bit markers in an array of 64-bit words. Its settings are the number of bits m, the number of hashes k and a seed. insert sets the markers; contains returns false for definitely absent and true for possibly present. The implementation does not support deletion, resizing, saving to disk or concurrent updates.</w:t>
       </w:r>
     </w:p>
     <w:p>
@@ -936,7 +936,7 @@
         <w:pStyle w:val="Normal"/>
       </w:pPr>
       <w:r>
-        <w:t xml:space="preserve">Each position uses a separately salted SplitMix64 finalizer reduced modulo m. Constants follow Vigna [3]. Hashing is deterministic and non-cryptographic; distinct salts do not prove independence. The experiments test controlled inputs, not a universal hash guarantee.</w:t>
+        <w:t xml:space="preserve">To calculate each position, the code mixes the key with a salt that depends on the seed and hash number, then takes the result modulo m. It uses the SplitMix64 finalizer and constants from Vigna [3]. This is a deterministic, non-cryptographic hash. Using different salts does not prove that the hash positions are independent.</w:t>
       </w:r>
     </w:p>
     <w:tbl>
@@ -1321,7 +1321,7 @@
         <w:pStyle w:val="Normal"/>
       </w:pPr>
       <w:r>
-        <w:t xml:space="preserve">The key invariant is that every bit required by an inserted key remains set. Initially all words are zero. Insertion visits the key’s k positions and uses bitwise OR to set each bit. OR preserves every previously set bit. Membership recomputes the same positions using the same m, k and seed. Therefore, every inserted key passes every check. This argument does not require the hashes to be independent.</w:t>
+        <w:t xml:space="preserve">The invariant is that every bit needed by an inserted key stays set. All bits start at zero. Insertion uses bitwise OR to set the key’s k positions without clearing existing bits. Lookup checks the same positions with the same settings. Therefore, an inserted key always returns true. This guarantee holds even if the hashes are not independent.</w:t>
       </w:r>
     </w:p>
     <w:p>
@@ -1329,7 +1329,7 @@
         <w:pStyle w:val="Normal"/>
       </w:pPr>
       <w:r>
-        <w:t xml:space="preserve">The word index is position / 64 and the bit offset is position % 64. UINT64_C(1) makes the mask unsigned and 64 bits wide; the offset is always between 0 and 63. This matters at word boundaries and for high bits. Storage rounds up to complete words without using an overflow-prone bits + 63 expression.</w:t>
+        <w:t xml:space="preserve">For a position p, p / 64 selects the word and p % 64 selects the bit inside it. UINT64_C(1) provides an unsigned constant wide enough to shift to any bit in a word. The offset stays between 0 and 63. The allocation rounds up to whole words and avoids adding 63 to bits, which could overflow for a very large input.</w:t>
       </w:r>
     </w:p>
     <w:p>
@@ -1337,7 +1337,7 @@
         <w:pStyle w:val="Normal"/>
       </w:pPr>
       <w:r>
-        <w:t xml:space="preserve">The deterministic demo inserts 10, 20 and 30 into m = 64, k = 3, seed = 7. Key 10 uses positions 30, 14 and 16. The uninserted key 37 is reported present, demonstrating a legitimate false positive. A separate mutation demo replaces |= with = and makes an inserted key fail. This mutation is deliberately broken demonstration code, not a defect found in the main implementation.</w:t>
+        <w:t xml:space="preserve">The demo uses m = 64, k = 3 and seed = 7, then inserts 10, 20 and 30. Key 10 uses positions 30, 14 and 16. Key 37 also returns true although it was never inserted: this is a false positive. A separate, deliberately broken example replaces |= with =. This clears earlier bits in the word and causes an inserted key to return false.</w:t>
       </w:r>
     </w:p>
     <w:p>
@@ -1345,7 +1345,7 @@
         <w:pStyle w:val="Normal"/>
       </w:pPr>
       <w:r>
-        <w:t xml:space="preserve">The final test suite passes 464,427 checks in both optimized and AddressSanitizer/UndefinedBehaviorSanitizer builds. It covers empty filters, invalid parameters, duplicate insertions, keys 0 and UINT64_MAX, word boundaries, saturation, full-scan agreement and exact-pipeline equivalence on each key. The accuracy study additionally checks 11,560,000 inserted-key memberships with zero false negatives. Tests support the argument above; they do not replace it.</w:t>
+        <w:t xml:space="preserve">The tests pass 464,427 checks in both the optimised build and the AddressSanitizer/UndefinedBehaviorSanitizer build. They cover empty filters, invalid settings, repeated insertions, keys 0 and UINT64_MAX, word boundaries and full filters. They also check that both query versions agree and that the filter followed by an exact set gives the correct answer for each tested key. The accuracy experiment checks another 11,560,000 inserted-key lookups with no false negatives.</w:t>
       </w:r>
     </w:p>
     <w:p>
@@ -1380,7 +1380,7 @@
         <w:pStyle w:val="Normal"/>
       </w:pPr>
       <w:r>
-        <w:t xml:space="preserve">The initial study had three questions. H1: at fixed bits per key, false-positive rates should follow the usual theoretical curve and have an interior minimum in k. H2: exceeding design capacity should increase false positives even though the implementation remains correct. H3: an exact pipeline with a Bloom prefilter should benefit mainly when queries are absent and the saved lookup cost exceeds the filter cost.</w:t>
+        <w:t xml:space="preserve">The study began with three hypotheses. H1: with a fixed number of bits per key, increasing k should first lower the false-positive rate and then raise it, following the theoretical curve. H2: inserting more keys than the filter was designed for should increase false positives without causing false negatives. H3: filtering before an exact lookup should help when it rejects enough missing keys to save more time than the filter takes.</w:t>
       </w:r>
     </w:p>
     <w:p>
@@ -1388,7 +1388,7 @@
         <w:pStyle w:val="Normal"/>
       </w:pPr>
       <w:r>
-        <w:t xml:space="preserve">For n distinct insertions into m bits, the probability that a bit remains unset under independent uniform hashing is (1 − 1/m)^(kn). The commonly used false-positive approximation is p ≈ (1 − exp(−kn/m))^k [1, 2]. It additionally approximates dependencies between queried bits. It is not an exact formula for this implementation.</w:t>
+        <w:t xml:space="preserve">For n distinct keys in m bits, independent uniform hashing gives a probability of (1 − 1/m)^(kn) that a bit stays zero. The usual approximation for the false-positive rate is p ≈ (1 − exp(−kn/m))^k [1, 2]. It treats the queried bit values as approximately independent, so it predicts the rate rather than giving an exact value for this implementation.</w:t>
       </w:r>
     </w:p>
     <w:p>
@@ -1396,7 +1396,7 @@
         <w:pStyle w:val="Normal"/>
       </w:pPr>
       <w:r>
-        <w:t xml:space="preserve">Writing b = m/n, minimizing this approximation gives k* ≈ b ln 2. At b = 10, k* ≈ 6.93, suggesting seven hashes. This minimizes the false-positive approximation at fixed storage, not wall-clock time or total system cost.</w:t>
+        <w:t xml:space="preserve">Let b = m/n be the average bit budget per key. The hash count that minimises the approximate false-positive rate is k* ≈ b ln 2. With b = 10, this gives k* ≈ 6.93, so seven hashes are a reasonable choice for accuracy. The formula does not include the time spent calculating and checking those hashes.</w:t>
       </w:r>
     </w:p>
     <w:tbl>
@@ -1724,7 +1724,7 @@
         <w:pStyle w:val="Normal"/>
       </w:pPr>
       <w:r>
-        <w:t xml:space="preserve">Accuracy uses eight seeded filters and 200,000 absent queries per configuration. Keys are the bijective mix64 transform of consecutive counters. Disjoint counter ranges guarantee absent queries. Seeds change the ranges and hash salts; comparisons within a seed reuse keys. The 560 accuracy rows contain 112 million absent-query evaluations, not 112 million independent datasets.</w:t>
+        <w:t xml:space="preserve">Each accuracy setting uses eight seeds and 200,000 absent queries. Applying the one-to-one mix64 mapping to separate counter ranges keeps inserted and absent keys distinct. Seeds change the ranges and salts; comparisons within a seed reuse keys. The 560 rows record 112 million query evaluations.</w:t>
       </w:r>
     </w:p>
     <w:p>
@@ -1732,7 +1732,7 @@
         <w:pStyle w:val="Normal"/>
       </w:pPr>
       <w:r>
-        <w:t xml:space="preserve">Timing uses four seeds, seven measured repetitions and 200,000 queries per repetition. Present queries sample inserted keys with replacement; absent queries are distinct. The mixture is shuffled. The three methods are an exact std::unordered_set, the approximate Bloom filter alone, and Bloom followed by the same exact set when needed. Only the first and third provide equivalent exact answers.</w:t>
+        <w:t xml:space="preserve">Timing uses four seeds, seven repetitions and 200,000 queries per repetition. Present keys are sampled with replacement; absent keys are distinct. Queries are shuffled. The methods are std::unordered_set alone, Bloom alone, and Bloom followed by the set for possible matches. This last method is the exact pipeline: the set verifies matches, keeping the final answer exact.</w:t>
       </w:r>
     </w:p>
     <w:p>
@@ -1740,7 +1740,7 @@
         <w:pStyle w:val="Normal"/>
       </w:pPr>
       <w:r>
-        <w:t xml:space="preserve">Generation, allocation, construction, validation and printing are outside lookup timing. Each method is warmed up; execution order is shuffled per repetition. Returned counts are checked and consumed by an observable accumulator. The exact set is reserved at maximum load factor 1.0 and uses mix64. This is one standard-library baseline, not all hash tables.</w:t>
+        <w:t xml:space="preserve">Only lookup is timed. Generation, allocation, construction, validation and printing are excluded. Methods are warmed up and randomly ordered in each repetition. Counts are checked and added to an observable accumulator so the compiler cannot discard the queries. The set uses mix64, reserves space for n keys and has maximum load factor 1.0.</w:t>
       </w:r>
     </w:p>
     <w:p>
@@ -1748,7 +1748,7 @@
         <w:pStyle w:val="Normal"/>
       </w:pPr>
       <w:r>
-        <w:t xml:space="preserve">For each seed, timing is summarized by the median of seven repetitions. Plots show the mean of these seed medians and a two-sided Student t 95% interval across four seeds. Speedup is paired within seed before summarizing. Accuracy intervals use eight seed-level rates [4]. Repeated loops are not treated as independent trials. These descriptive intervals do not cover all machine or workload uncertainty.</w:t>
+        <w:t xml:space="preserve">For each seed, the analysis takes the median of seven timings, then reports the mean of the four medians and a two-sided Student t 95% interval. Speedup is calculated within each seed before averaging. Accuracy intervals use eight seed-level rates [4]. Repetitions are not independent samples. The intervals describe seed variation, not all machine or workload uncertainty.</w:t>
       </w:r>
     </w:p>
     <w:p>
@@ -1815,7 +1815,7 @@
         <w:rPr>
           <w:sz w:val="20"/>
         </w:rPr>
-        <w:t xml:space="preserve">Figure 1. Left: eight-seed mean false-positive rates with 95% intervals and theoretical lines. Right: fixed-size filter loaded beyond design capacity. Some error bars are smaller than the markers.</w:t>
+        <w:t xml:space="preserve">Figure 1. Left: mean false-positive rates across eight seeds, with 95% intervals and theoretical curves. Right: the effect of inserting more keys into a fixed-size filter. Some error bars are too small to see.</w:t>
       </w:r>
     </w:p>
     <w:tbl>
@@ -2261,7 +2261,7 @@
         <w:spacing w:before="140"/>
       </w:pPr>
       <w:r>
-        <w:t xml:space="preserve">At 10 bits per key, k = 7 gives 0.821 ± 0.016 percentage points, close to the theoretical 0.819%. Increasing k to 16 raises the measured rate to 2.714%. More positions must match, but inserting each key also sets more bits. Beyond the minimum, the increased occupancy outweighs the benefit of extra checks.</w:t>
+        <w:t xml:space="preserve">At 10 bits per key, k = 7 gives a false-positive rate of 0.821 ± 0.016 percentage points, close to the predicted 0.819%. Raising k to 16 increases the measured rate to 2.714%. More hashes make a query check more positions, but they also set more bits during insertion. When the array becomes too full, the extra checks no longer reduce false positives.</w:t>
       </w:r>
     </w:p>
     <w:p>
@@ -2269,7 +2269,7 @@
         <w:pStyle w:val="Normal"/>
       </w:pPr>
       <w:r>
-        <w:t xml:space="preserve">At 16 bits per key, the smallest sample mean occurs at k = 12 rather than the rounded theoretical choice of 11. Nearby intervals overlap. This is not strong evidence that the theoretical optimum is wrong; selecting the smallest noisy estimate can move the apparent optimum. The curve and its uncertainty matter more than a single winning integer.</w:t>
+        <w:t xml:space="preserve">At 16 bits per key, k = 12 has the lowest measured mean, while the rounded theoretical choice is 11. The confidence intervals for nearby choices overlap, so the result does not clearly show that 12 is better. Random variation can change which setting has the smallest measured value.</w:t>
       </w:r>
     </w:p>
     <w:p>
@@ -2655,7 +2655,7 @@
         <w:spacing w:before="140"/>
       </w:pPr>
       <w:r>
-        <w:t xml:space="preserve">With m = 200,000 and k = 7, doubling the intended 20,000-key capacity raises false positives from 0.821% to 13.841%; tripling it raises them to 40.182%. Inserted keys still pass. This is saturation, not a correctness failure: design capacity is an accuracy budget rather than a hard insertion limit.</w:t>
+        <w:t xml:space="preserve">With m = 200,000 and k = 7, the filter was designed for 20,000 keys. At twice that capacity, false positives rise from 0.821% to 13.841%; at three times capacity, they reach 40.182%. Inserted keys still pass, but the fuller array rejects fewer absent keys.</w:t>
       </w:r>
     </w:p>
     <w:p>
@@ -2663,7 +2663,7 @@
         <w:pStyle w:val="Normal"/>
       </w:pPr>
       <w:r>
-        <w:t xml:space="preserve">At one quarter of capacity, only three false positives appear across 1.6 million absent-query evaluations. This is insufficient for a precise tail estimate. A near-zero observation does not prove that false positives are impossible.</w:t>
+        <w:t xml:space="preserve">At one quarter of capacity, only three false positives occurred in 1.6 million absent queries. There are too few errors to estimate this small probability precisely.</w:t>
       </w:r>
     </w:p>
     <w:tbl>
@@ -2920,7 +2920,7 @@
         <w:spacing w:before="140"/>
       </w:pPr>
       <w:r>
-        <w:t xml:space="preserve">Bloom-only storage is about 25.6 times smaller but gives approximate answers. The exact pipeline adds 250,000 bytes, about 3.9%. A counting allocator records requested set-node and bucket bytes; Bloom storage counts word payload. Object headers, allocator metadata and input vectors are excluded. These are structure-storage figures, not resident-memory measurements.</w:t>
+        <w:t xml:space="preserve">The exact set uses about 25.6 times the storage of the filter, but gives exact answers. Adding the filter to the set costs another 250,000 bytes, or 3.9%. Measurements count requested set-node and bucket bytes and the filter’s word array. They exclude object headers, allocator metadata and input vectors, rather than measuring total process memory.</w:t>
       </w:r>
     </w:p>
     <w:p>
@@ -2987,7 +2987,7 @@
         <w:rPr>
           <w:sz w:val="20"/>
         </w:rPr>
-        <w:t xml:space="preserve">Figure 2. Exact set time divided by filtered-set time. Values above 1 favour the prefilter. Error bars are 95% intervals across four paired seed-level ratios.</w:t>
+        <w:t xml:space="preserve">Figure 2. Set-only query time divided by filter-plus-set query time. A value above 1 means the filter speeds up exact lookup. Error bars show 95% intervals across four paired seed ratios.</w:t>
       </w:r>
     </w:p>
     <w:tbl>
@@ -3433,7 +3433,7 @@
         <w:spacing w:before="140"/>
       </w:pPr>
       <w:r>
-        <w:t xml:space="preserve">The accuracy-optimal k = 7 did not reliably accelerate these in-memory lookups. For n = 20,000 and all-absent queries, its speedup is 0.713 ± 0.021, meaning a slowdown. In contrast, k = 1 gives 2.871 ± 0.357. Although one hash admits more false positives, it is cheaper and still rejects most absent keys.</w:t>
+        <w:t xml:space="preserve">Seven hashes gave a low error rate but did not consistently make exact lookup faster. With 20,000 keys and all queries absent, its speedup was 0.713 ± 0.021, meaning it was slower than the set alone. One hash gave 2.871 ± 0.357. Although it allowed more false positives, it took less time to check and still rejected most absent keys.</w:t>
       </w:r>
     </w:p>
     <w:p>
@@ -3441,7 +3441,7 @@
         <w:pStyle w:val="Normal"/>
       </w:pPr>
       <w:r>
-        <w:t xml:space="preserve">For n = 200,000 and all-absent queries, the k = 7 interval spans 1. The run is inconclusive about a speed advantage there. All-present workloads consistently penalize the prefilter because every query pays for both structures. A prefilter should be selected for the query mix and backend cost, not for low false-positive rate alone.</w:t>
+        <w:t xml:space="preserve">With 200,000 keys and all queries absent, the interval for k = 7 includes 1, so this run does not clearly show a speed advantage. When all queried keys were present, adding the filter always made lookup slower because every query still reached the set. The benefit depends on the proportion of absent queries and the cost of checking the set.</w:t>
       </w:r>
     </w:p>
     <w:p>
@@ -3508,7 +3508,7 @@
         <w:rPr>
           <w:sz w:val="20"/>
         </w:rPr>
-        <w:t xml:space="preserve">Figure 3. Follow-up ablation at k = 7. The early-exit and full-scan variants return identical results on every checked query. Bars show means of seed medians, with 95% intervals.</w:t>
+        <w:t xml:space="preserve">Figure 3. Early exit compared with full scanning at k = 7. Both give the same result for every checked query. Bars show the mean of the seed medians, with 95% intervals.</w:t>
       </w:r>
     </w:p>
     <w:p>
@@ -3516,7 +3516,7 @@
         <w:pStyle w:val="Normal"/>
       </w:pPr>
       <w:r>
-        <w:t xml:space="preserve">The main run unexpectedly measured absent Bloom queries as slower than present queries. This motivated a separate, post-hoc experiment rather than a change to the original benchmark. It compares the core early-exit query with a diagnostic full scan over a reconstructed packed layout, using the same positions and contents. Each configuration has four seeds and seven timed repetitions. Source-level bit-probe counts are collected outside timing.</w:t>
+        <w:t xml:space="preserve">In the main experiment, Bloom queries for absent keys took longer than queries for present keys, even though they could stop early. A separate experiment compared early exit with a version that checks all k positions, called a full scan. The full scan used a separate word array with the same contents and positions. Each setting used four seeds and seven timed repetitions. Bit checks were counted outside timing.</w:t>
       </w:r>
     </w:p>
     <w:p>
@@ -3524,7 +3524,7 @@
         <w:pStyle w:val="Normal"/>
       </w:pPr>
       <w:r>
-        <w:t xml:space="preserve">At n = 200,000, an absent early-exit query checks about 1.996 positions on average but takes 41.69 ± 1.96 ns. The full scan checks all seven positions and takes 23.58 ± 0.50 ns. The smaller dataset shows the same direction. Fewer logical probes therefore do not imply lower elapsed time for this compiled implementation.</w:t>
+        <w:t xml:space="preserve">With n = 200,000, early exit checked about 1.996 positions per absent query and took 41.69 ± 1.96 ns. Full scanning checked all seven positions but took only 23.58 ± 0.50 ns. The smaller dataset showed the same pattern. In these tests, checking fewer bits did not make the query faster.</w:t>
       </w:r>
     </w:p>
     <w:p>
@@ -3532,7 +3532,7 @@
         <w:pStyle w:val="Normal"/>
       </w:pPr>
       <w:r>
-        <w:t xml:space="preserve">The result is consistent with differences in branching and generated machine code. It does not isolate branch prediction: no branch counters or assembly analysis were collected, and the diagnostic layout has a different allocation address. Section 2.7 now tests both versions inside exact pipelines using one shared Bloom object. The original measurements are retained separately; no timing values from the two runs are pooled.</w:t>
+        <w:t xml:space="preserve">Branches and compiler-generated code may explain the difference, but no branch counters or assembly analysis were collected. The two arrays also had different memory addresses. The next experiment removes that storage difference and compares both versions as part of exact lookup. Its timings are reported separately from this run.</w:t>
       </w:r>
     </w:p>
     <w:p>
@@ -3599,7 +3599,7 @@
         <w:rPr>
           <w:sz w:val="20"/>
         </w:rPr>
-        <w:t xml:space="preserve">Figure 4. Separately dated paired experiment. Values above 1 indicate faster exact lookup than the set alone. Error bars are 95% intervals across four seed-level ratios.</w:t>
+        <w:t xml:space="preserve">Figure 4. The September 22 comparison of both exact pipelines. Values above 1 mean faster lookup than the set alone. Error bars show 95% intervals across four seed ratios.</w:t>
       </w:r>
     </w:p>
     <w:p>
@@ -3607,7 +3607,7 @@
         <w:pStyle w:val="Normal"/>
       </w:pPr>
       <w:r>
-        <w:t xml:space="preserve">The follow-up uses contains and contains_full_scan on the same Bloom object and the same exact set. Both variants have identical positions, contents and backend-call counts. The full scan accumulates every bit test with &amp;= and has no source-level early return. Each query is checked against the exact set before timing.</w:t>
+        <w:t xml:space="preserve">The next experiment uses contains and contains_full_scan on the same Bloom object, followed by the same exact set. Both versions read the same bits and send the same queries to the set. Full scanning uses &amp;= to combine all bit checks without an early return. Before timing, both versions are checked against the exact set for every query.</w:t>
       </w:r>
     </w:p>
     <w:p>
@@ -3615,7 +3615,7 @@
         <w:pStyle w:val="Normal"/>
       </w:pPr>
       <w:r>
-        <w:t xml:space="preserve">The design uses two set sizes, k = 1 or 7, four absent fractions, four seeds, seven repetitions and 200,000 queries per repetition (1,344 timing rows). Generation and validation are outside timing. Methods are warmed up and randomly ordered. Ratios are paired within seed after taking repetition medians. k = 1 is a control where both variants check one position.</w:t>
+        <w:t xml:space="preserve">The experiment uses two set sizes, k = 1 or 7, four absent-query proportions and four seeds. Each method has seven repetitions of 200,000 queries, giving 1,344 timing rows. Data generation and validation stay outside timing. Methods are warmed up and run in random order. Analysis uses the same seed-median and paired-ratio method as before. With k = 1, both query versions check just one bit, providing a useful control.</w:t>
       </w:r>
     </w:p>
     <w:tbl>
@@ -3992,7 +3992,7 @@
         <w:pStyle w:val="Normal"/>
       </w:pPr>
       <w:r>
-        <w:t xml:space="preserve">For 200,000 keys and all-absent queries, full scanning speeds up the exact pipeline by 1.812 ± 0.034 times relative to early exit. Relative to the set alone, full scanning gives 1.282 ± 0.098 times speedup; early exit gives 0.707 ± 0.041. Thus the original component-level observation can translate into an end-to-end benefit.</w:t>
+        <w:t xml:space="preserve">With 200,000 keys, k = 7 and all queries absent, full scanning makes the exact pipeline 1.812 ± 0.034 times as fast as early exit. Compared with the set alone, the speedup is 1.282 ± 0.098 for full scanning and 0.707 ± 0.041 for early exit. Full scanning therefore improves the whole lookup process in this setting, not only the filter by itself.</w:t>
       </w:r>
     </w:p>
     <w:p>
@@ -4000,7 +4000,7 @@
         <w:pStyle w:val="Normal"/>
       </w:pPr>
       <w:r>
-        <w:t xml:space="preserve">The benefit depends on workload. At 50% absent queries, the full/early speed ratio is 0.859 ± 0.006: full scanning is slower. At 90% absent queries, its speedup over the direct set is 1.011 ± 0.028; the interval spans 1. Neither result supports a universal full-scan recommendation.</w:t>
+        <w:t xml:space="preserve">The result changes with the queries. When half are absent, the full-scan/early-exit speed ratio is 0.859 ± 0.006, so full scanning is slower. With 90% absent queries, its speedup over the set alone is 1.011 ± 0.028. That interval includes 1, so there is no clear advantage over the set in this case.</w:t>
       </w:r>
     </w:p>
     <w:p>
@@ -4008,7 +4008,7 @@
         <w:pStyle w:val="Normal"/>
       </w:pPr>
       <w:r>
-        <w:t xml:space="preserve">The smaller set also benefits at k = 7 with all-absent queries (full-scan/set speedup 1.217 ± 0.009). However, k = 1 with early exit remains faster in the all-absent workload at n = 200,000 (2.726 ± 0.055 times the set). Lower error and faster execution remain different objectives.</w:t>
+        <w:t xml:space="preserve">For the smaller set, full scanning with k = 7 also helps when all queries are absent: its speedup over the set alone is 1.217 ± 0.009. However, one hash with early exit remains faster in the 200,000-key, all-absent test, with a speedup of 2.726 ± 0.055. Improving the seven-hash version does not make it the fastest tested setting.</w:t>
       </w:r>
     </w:p>
     <w:p>
@@ -4016,7 +4016,7 @@
         <w:pStyle w:val="Normal"/>
       </w:pPr>
       <w:r>
-        <w:t xml:space="preserve">The shared object removes the separate Bloom allocation from the original diagnostic comparison. k = 1 shows much smaller version differences than k = 7 on miss-heavy workloads. This narrows the explanation, but does not isolate branch prediction, vectorization or instruction scheduling. Compiler output and hardware counters were not analysed. Fixed configuration order, background load and four seeds limit generalisation.</w:t>
+        <w:t xml:space="preserve">Using one Bloom object removes the different array addresses from the earlier comparison. With k = 1, the timing differences between versions are much smaller than with k = 7 when most queries are absent. However, the experiment does not separate the effects of branches, vectorisation or instruction scheduling. It uses four seeds, a fixed order of configurations and an active desktop machine.</w:t>
       </w:r>
     </w:p>
     <w:p>
@@ -4039,7 +4039,7 @@
         <w:pStyle w:val="Normal"/>
       </w:pPr>
       <w:r>
-        <w:t xml:space="preserve">Let q be the absent-query fraction and p the false-positive rate. The approximate backend-call fraction is r = (1 − q) + qp. Adding cost L per backend call gives Tset(L) = Tset(0) + L and Tfiltered(L) = Tfiltered(0) + rL. For r &lt; 1, the break-even additional cost is L* = (Tfiltered(0) − Tset(0))/(1 − r).</w:t>
+        <w:t xml:space="preserve">Let q be the fraction of queries for absent keys and p the false-positive rate. The fraction reaching the exact set is approximately r = (1 − q) + qp: all present keys and the false positives need an exact check. If each set lookup costs an extra L, then Tset(L) = Tset(0) + L and Tfiltered(L) = Tfiltered(0) + rL. For r &lt; 1, the extra cost at which the methods take equal time is L* = (Tfiltered(0) − Tset(0))/(1 − r).</w:t>
       </w:r>
     </w:p>
     <w:p>
@@ -4047,7 +4047,7 @@
         <w:pStyle w:val="Normal"/>
       </w:pPr>
       <w:r>
-        <w:t xml:space="preserve">Using paired measurements at n = 20,000, k = 7 and all-absent queries gives L* between 11.18 and 12.17 ns across seeds. This is a derived threshold under a constant extra-cost assumption. It is not a database or network measurement; real backends can have batching, caching, concurrency and different hit/miss costs.</w:t>
+        <w:t xml:space="preserve">For n = 20,000, k = 7 and all queries absent, the original paired timings give L* values between 11.18 and 12.17 ns across seeds. This estimates how much extra lookup cost would make filtering worthwhile. It assumes the same extra cost for every set lookup; real databases or networks may behave differently because of caching, batching, concurrency and different costs for hits and misses.</w:t>
       </w:r>
     </w:p>
     <w:p>
@@ -4055,7 +4055,7 @@
         <w:pStyle w:val="Normal"/>
       </w:pPr>
       <w:r>
-        <w:t xml:space="preserve">Both runs used an Apple M2 with 8 GB memory, macOS 14.4.1 and Apple Clang 15, using C++17 and -O3. CPU affinity, power state and background load were uncontrolled. Some intervals are wide. Warm queries, two set sizes and uniform integer keys do not represent cold storage, skew or adversarial inputs. The shared generator/filter mixer also limits independence conclusions.</w:t>
+        <w:t xml:space="preserve">Both runs used an Apple M2 with 8 GB memory, macOS 14.4.1 and Apple Clang 15, compiling C++17 with -O3. CPU affinity, power state and background activity were not controlled. The tests use warmed-up queries, two set sizes and uniform integer keys. They do not cover cold storage, skewed queries or adversarial inputs. Data generation and filtering also share the same mixer family.</w:t>
       </w:r>
     </w:p>
     <w:p>
@@ -4063,7 +4063,7 @@
         <w:pStyle w:val="Normal"/>
       </w:pPr>
       <w:r>
-        <w:t xml:space="preserve">Construction times are separate single observations, excluded from query speedups. Each set-build time is repeated across k rows in the memory CSV, not independently remeasured. Recommendation: use about seven hashes for a 1% error target at 10 bits per key, but benchmark cheaper settings for exact in-memory throughput. Recheck capacity and workload assumptions.</w:t>
+        <w:t xml:space="preserve">Construction was measured separately and is excluded from query speedups. Each set-build time is one observation copied across the relevant k rows in the memory CSV, not a new measurement in each row. The performance comparison therefore concerns repeated lookups after the structures have been built.</w:t>
       </w:r>
     </w:p>
     <w:p>
@@ -4086,7 +4086,7 @@
         <w:pStyle w:val="Normal"/>
       </w:pPr>
       <w:r>
-        <w:t xml:space="preserve">First decide whether approximate membership is acceptable or exact answers are required. For an approximate filter, choose the bit budget and k to meet an error target. For exact answers, retain the backend and measure total lookup time; the filter adds memory and only saves some backend calls.</w:t>
+        <w:t xml:space="preserve">Choose the setting based on the answer guarantee and the work it needs to save. If false positives are acceptable, select m and k for the error target. If answers must be exact, keep the set and measure the combined query time. In that case, the filter uses extra memory to avoid some set lookups.</w:t>
       </w:r>
     </w:p>
     <w:tbl>
@@ -4217,7 +4217,7 @@
                 <w:sz w:val="20"/>
                 <w:color w:val="000000"/>
               </w:rPr>
-              <w:t xml:space="preserve">Use about 7 hashes at design capacity; monitor occupancy and distinct insertions.</w:t>
+              <w:t xml:space="preserve">Use about 7 hashes at design capacity. Check how full the array becomes as more keys are inserted.</w:t>
             </w:r>
           </w:p>
         </w:tc>
@@ -4248,7 +4248,7 @@
                 <w:sz w:val="20"/>
                 <w:color w:val="000000"/>
               </w:rPr>
-              <w:t xml:space="preserve">High exact throughput with 90–100% absent queries</w:t>
+              <w:t xml:space="preserve">Faster exact lookup with 90–100% absent queries</w:t>
             </w:r>
           </w:p>
         </w:tc>
@@ -4274,7 +4274,7 @@
                 <w:sz w:val="20"/>
                 <w:color w:val="000000"/>
               </w:rPr>
-              <w:t xml:space="preserve">Test cheaper hashing first. k = 1 outperformed k = 7 in the paired follow-up.</w:t>
+              <w:t xml:space="preserve">Test fewer hashes first. In the follow-up, k = 1 was faster than k = 7.</w:t>
             </w:r>
           </w:p>
         </w:tc>
@@ -4331,7 +4331,7 @@
                 <w:sz w:val="20"/>
                 <w:color w:val="000000"/>
               </w:rPr>
-              <w:t xml:space="preserve">Prefer direct set lookup in these tests; the filter could not avoid backend calls.</w:t>
+              <w:t xml:space="preserve">Use the set directly for these tested workloads. The filter did not avoid any set lookups.</w:t>
             </w:r>
           </w:p>
         </w:tc>
@@ -4388,7 +4388,7 @@
                 <w:sz w:val="20"/>
                 <w:color w:val="000000"/>
               </w:rPr>
-              <w:t xml:space="preserve">Full scanning improved the exact pipeline in both tested sizes.</w:t>
+              <w:t xml:space="preserve">Test full scanning. It improved exact lookup at both tested set sizes.</w:t>
             </w:r>
           </w:p>
         </w:tc>
@@ -4445,7 +4445,7 @@
                 <w:sz w:val="20"/>
                 <w:color w:val="000000"/>
               </w:rPr>
-              <w:t xml:space="preserve">Benchmark both query variants and the direct baseline; full scanning lost to early exit at 50% absent.</w:t>
+              <w:t xml:space="preserve">Compare both versions with the set alone. Early exit was faster than full scanning at 50% absent.</w:t>
             </w:r>
           </w:p>
         </w:tc>
@@ -4457,7 +4457,7 @@
         <w:spacing w:before="140"/>
       </w:pPr>
       <w:r>
-        <w:t xml:space="preserve">These are conditional decisions for the measured C++17 implementation and integer workloads, not universal best parameters. A slower backend can make stronger filtering worthwhile. Capacity growth, key distribution, compiler or machine changes require new measurements. The study did not compare alternative mixer constants or prove their optimality.</w:t>
+        <w:t xml:space="preserve">These recommendations apply to the tested C++17 code and integer queries. A more expensive exact lookup may make stronger filtering worthwhile. Changes in capacity, query distribution, compiler or machine need new measurements. Alternative mixer constants were not compared, so the study does not establish that the chosen constants are best.</w:t>
       </w:r>
     </w:p>
     <w:p>
@@ -4492,7 +4492,7 @@
         <w:pStyle w:val="Normal"/>
       </w:pPr>
       <w:r>
-        <w:t xml:space="preserve">The most useful lesson is the difference between optimizing a component and optimizing the whole pipeline. Seven hashes gave a false-positive rate of 0.821%, whereas one hash gave 9.502%. However, for 200,000 keys and all-absent queries, the exact pipeline with one hash was about 2.71 times as fast as the direct set. The original seven-hash early-exit pipeline had no clear speed advantage. Reducing false positives has value only in relation to the work avoided.</w:t>
+        <w:t xml:space="preserve">I learned to separate low error from fast exact lookup. Seven hashes gave 0.821% false positives, compared with 9.502% for one hash. However, with 200,000 keys and all queries absent, the one-hash exact pipeline was about 2.71 times as fast as the set alone. The original seven-hash early-exit version showed no clear speed advantage. Extra filtering is useful only when the lookups it avoids save enough time to pay for it.</w:t>
       </w:r>
     </w:p>
     <w:p>
@@ -4512,7 +4512,7 @@
         <w:pStyle w:val="Normal"/>
       </w:pPr>
       <w:r>
-        <w:t xml:space="preserve">The early-exit experiment makes this lesson concrete. The absent-query path reduced the mean logical probes from seven to about two, yet the full scan was faster. Counting source-level operations is useful, but it leaves out how a processor executes branches and how a compiler transforms loops. The new shared-storage pipeline comparison strengthens the practical result: full scanning helps at 100% absent queries but loses to early exit at 50%. It still does not identify one hardware cause as proven.</w:t>
+        <w:t xml:space="preserve">The early-exit result showed why counting operations is not enough to predict runtime. It checked about two bits on average, yet checking all seven was faster. The later exact-pipeline test also showed that full scanning helped when all queries were absent but lost to early exit when half were absent. This makes workload testing necessary; the code with fewer checks is not automatically the faster choice.</w:t>
       </w:r>
     </w:p>
     <w:p>
@@ -4532,7 +4532,7 @@
         <w:pStyle w:val="Normal"/>
       </w:pPr>
       <w:r>
-        <w:t xml:space="preserve">An overloaded Bloom filter can remain correct while becoming much less useful. At triple capacity it still produced no false negatives, but roughly 40% of absent queries passed. This changes how success should be defined: a test suite needs functional invariants, while the evaluation needs an accuracy target and an operating range. Merely showing that insert and contains run successfully would miss the main failure in usefulness.</w:t>
+        <w:t xml:space="preserve">I also learned that a correct filter can become less useful. At three times its design capacity, it still had no false negatives, but about 40% of absent queries passed through. Correctness tests need to check that inserted keys are never rejected. Performance tests also need to check whether the error rate is acceptable at the intended capacity.</w:t>
       </w:r>
     </w:p>
     <w:p>
@@ -4555,7 +4555,7 @@
         <w:pStyle w:val="Normal"/>
       </w:pPr>
       <w:r>
-        <w:t xml:space="preserve">The memory comparison also requires an explicit definition of what is being replaced. A 250,000-byte approximate filter and a 6,400,024-byte exact set answer different questions. Once the exact set is retained to verify positives, the filter increases total structure storage. The smaller number is useful only when its weaker guarantee fits the application.</w:t>
+        <w:t xml:space="preserve">The memory comparison taught me to check what each structure provides. The filter used 250,000 bytes and the exact set used 6,400,024 bytes, but they offered different answer guarantees. Keeping the exact set to check possible matches increased total storage. The small filter only replaces the set when false positives are acceptable.</w:t>
       </w:r>
     </w:p>
     <w:p>
@@ -4563,7 +4563,7 @@
         <w:pStyle w:val="Normal"/>
       </w:pPr>
       <w:r>
-        <w:t xml:space="preserve">The apparent best hash count at 16 bits per key was another reminder to examine uncertainty. The measured minimum at 12 hashes is not automatically a new algorithmic discovery. Nearby choices have similar rates, and the minimum was selected from many estimates. Reporting the whole curve avoids making the conclusion depend on a noisy winner.</w:t>
+        <w:t xml:space="preserve">The hash-count results also showed why I should consider uncertainty. At 16 bits per key, 12 hashes had the lowest measured error rate, but nearby settings had overlapping intervals. I cannot conclude that 12 is truly better from that minimum alone. The full curve gives a clearer picture than naming one setting as the winner.</w:t>
       </w:r>
     </w:p>
     <w:p>
@@ -4571,7 +4571,7 @@
         <w:pStyle w:val="Normal"/>
       </w:pPr>
       <w:r>
-        <w:t xml:space="preserve">Finally, test counts do not by themselves establish test independence. The first bit-vector oracle reused the filter’s position helper, so it could detect packing errors while sharing a hash-indexing error. Review led to fixed known-answer checks and per-key exact-pipeline checks. This gives stronger evidence, while still leaving the statistical quality of the salted hash family as an assumption rather than a proof.</w:t>
+        <w:t xml:space="preserve">Finally, many passing checks are not enough if the test repeats the same mistake as the implementation. The first reference bit array reused position(), so it could detect storage errors but miss an error in position(). Review added fixed expected values and checked the exact pipeline against the set for each key. Those checks strengthen correctness evidence, while hash distribution still needs separate evaluation.</w:t>
       </w:r>
     </w:p>
     <w:p>
@@ -4594,7 +4594,7 @@
         <w:pStyle w:val="Normal"/>
       </w:pPr>
       <w:r>
-        <w:t xml:space="preserve">I used OpenAI Codex extensively for topic selection, implementation, tests, experimental design and execution, analysis, documentation and report drafting. It also adapted the Word template and uploaded the repository. The September 22 revision added the full-scan API, equivalence checks, paired pipeline experiment and conditional recommendations with Codex assistance. Most code and report text were AI-generated; I do not claim to have independently written every line or run every command.</w:t>
+        <w:t xml:space="preserve">I used OpenAI Codex for most of the code and report, including implementation, debugging, tests, experiment design, running measurements, analysis and drafting. It also adapted the Word template and uploaded the repository. The September 22 revision used Codex to add full scanning, compare the two exact pipelines and update the recommendations.</w:t>
       </w:r>
     </w:p>
     <w:p>
@@ -4602,7 +4602,7 @@
         <w:pStyle w:val="Normal"/>
       </w:pPr>
       <w:r>
-        <w:t xml:space="preserve">The first generated reference test reused BloomFilter::position. It checked packed storage but could share an indexing bug. AI-assisted review added fixed mixer/index vectors and per-key equality between the exact pipeline and the set. The initial version is preserved in commit 93063ae; the correction is visible in the test diff.</w:t>
+        <w:t xml:space="preserve">One problem was that the first generated reference test reused BloomFilter::position. If that function was wrong, the test could repeat the same error. AI-assisted review added fixed expected mixer outputs and positions, plus checks that the exact pipeline and set agreed on each key. Commit 93063ae contains the initial version, and the test diff records the changes.</w:t>
       </w:r>
     </w:p>
     <w:p>
@@ -4610,7 +4610,7 @@
         <w:pStyle w:val="Normal"/>
       </w:pPr>
       <w:r>
-        <w:t xml:space="preserve">The analysis script also assumed SciPy and Matplotlib were installed. Execution failed with ModuleNotFoundError for scipy, then matplotlib. The fix used explicit t critical values for the supported seed counts and installed plotting dependencies locally. Commands, package versions and successful output are recorded. The raw measurements were unchanged.</w:t>
+        <w:t xml:space="preserve">Another problem was that the generated analysis script assumed SciPy and Matplotlib were installed. It failed with ModuleNotFoundError for scipy and then matplotlib. The fix replaced the SciPy dependency with explicit t critical values for the supported seed counts and installed the plotting dependencies locally. The commands and successful output were recorded; the raw measurements stayed unchanged.</w:t>
       </w:r>
     </w:p>
     <w:p>
@@ -4618,7 +4618,7 @@
         <w:pStyle w:val="Normal"/>
       </w:pPr>
       <w:r>
-        <w:t xml:space="preserve">Codex ran compilation, tests, sanitizers, CSV checks and figure regeneration. During code review, I worked through packed bit indexing, the insertion invariant and the query logic. I relied on the published mixer constants rather than deriving them; the study does not prove hash independence or identify the hardware cause of the timing differences. The deliberate |= mutation is an educational example, not an accidental AI bug.</w:t>
+        <w:t xml:space="preserve">Codex ran the builds, tests, sanitizers, CSV checks and plot generation. I worked through the bit indexing, insertion invariant and query logic during code review. I relied on the published mixer constants rather than deriving them. Hash independence and the hardware cause of the timing results remain unproven. The |= to = example was deliberately written to show a failure, rather than being an accidental AI bug.</w:t>
       </w:r>
     </w:p>
     <w:p>

</xml_diff>

<commit_message>
Clarify implementation choices and full-scan extension in report
</commit_message>
<xml_diff>
--- a/docs/Bloom_Filter_Report.docx
+++ b/docs/Bloom_Filter_Report.docx
@@ -920,7 +920,7 @@
         <w:pStyle w:val="Normal"/>
       </w:pPr>
       <w:r>
-        <w:t xml:space="preserve">This project uses C++17 to implement a Bloom filter that supports insertion and lookup. The experiments compare its error rate, memory use and query time. The main finding is that fewer false positives do not always mean faster queries. With many queries for missing keys, using one hash was faster than using seven, even though seven gave a lower error rate.</w:t>
+        <w:t xml:space="preserve">This project implements an insertion-only Bloom filter in C++17, using explicit unsigned arithmetic and bit operations. A query returns either definitely absent or possibly present.</w:t>
       </w:r>
     </w:p>
     <w:p>
@@ -928,7 +928,7 @@
         <w:pStyle w:val="Normal"/>
       </w:pPr>
       <w:r>
-        <w:t xml:space="preserve">The filter takes unsigned 64-bit keys as input and stores their bit markers in an array of 64-bit words. Its settings are the number of bits m, the number of hashes k and a seed. insert sets the markers; contains returns false for definitely absent and true for possibly present. The implementation does not support deletion, resizing, saving to disk or concurrent updates.</w:t>
+        <w:t xml:space="preserve">Keys are unsigned 64-bit integers, keeping string encoding and variable-length hashing outside the study. A vector packs the bit markers into 64-bit words for compact storage. The bit count m, hash count k and seed are fixed at construction. Deletion and resizing are not supported.</w:t>
       </w:r>
     </w:p>
     <w:p>
@@ -936,7 +936,15 @@
         <w:pStyle w:val="Normal"/>
       </w:pPr>
       <w:r>
-        <w:t xml:space="preserve">To calculate each position, the code mixes the key with a salt that depends on the seed and hash number, then takes the result modulo m. It uses the SplitMix64 finalizer and constants from Vigna [3]. This is a deterministic, non-cryptographic hash. Using different salts does not prove that the hash positions are independent.</w:t>
+        <w:t xml:space="preserve">The textbook model assumes independent hashes. This implementation uses the SplitMix64 finalizer and constants from Vigna [3]. Each position combines the key with a salt based on the seed and hash number, then reduces the mixed result modulo m. The mapping is repeatable and non-cryptographic; different salts do not establish independence.</w:t>
+      </w:r>
+    </w:p>
+    <w:p>
+      <w:pPr>
+        <w:pStyle w:val="Normal"/>
+      </w:pPr>
+      <w:r>
+        <w:t xml:space="preserve">The standard contains method stops at the first zero bit. The added contains_full_scan checks all k positions. Both read the same stored bits and return the same answer, allowing their query times to be compared.</w:t>
       </w:r>
     </w:p>
     <w:tbl>

</xml_diff>

<commit_message>
Define report notation and typeset editable mathematical equations
</commit_message>
<xml_diff>
--- a/docs/Bloom_Filter_Report.docx
+++ b/docs/Bloom_Filter_Report.docx
@@ -580,7 +580,7 @@
       </w:pPr>
       <w:hyperlink w:anchor="study_1">
         <w:r>
-          <w:t xml:space="preserve">1.1 Correctness and the difficult step</w:t>
+          <w:t xml:space="preserve">1.1 Implementation details and correctness</w:t>
         </w:r>
       </w:hyperlink>
       <w:r>
@@ -936,7 +936,7 @@
         <w:pStyle w:val="Normal"/>
       </w:pPr>
       <w:r>
-        <w:t xml:space="preserve">The textbook model assumes independent hashes. This implementation uses the SplitMix64 finalizer and constants from Vigna [3]. Each position combines the key with a salt based on the seed and hash number, then reduces the mixed result modulo m. The mapping is repeatable and non-cryptographic; different salts do not establish independence.</w:t>
+        <w:t xml:space="preserve">The textbook model assumes independent hashes. This implementation uses the SplitMix64 finalizer and constants from Vigna [3]. Each position combines the key with a salt (an extra mixing value) based on the seed and hash number, then reduces the mixed result modulo m. The mapping is repeatable and non-cryptographic; different salts do not establish independence.</w:t>
       </w:r>
     </w:p>
     <w:p>
@@ -1320,7 +1320,7 @@
       </w:pPr>
       <w:bookmarkStart w:id="3001" w:name="study_1"/>
       <w:r>
-        <w:t xml:space="preserve">1.1 Correctness and the difficult step</w:t>
+        <w:t xml:space="preserve">1.1 Implementation details and correctness</w:t>
       </w:r>
       <w:bookmarkEnd w:id="3001"/>
     </w:p>
@@ -1337,7 +1337,7 @@
         <w:pStyle w:val="Normal"/>
       </w:pPr>
       <w:r>
-        <w:t xml:space="preserve">For a position p, p / 64 selects the word and p % 64 selects the bit inside it. UINT64_C(1) provides an unsigned constant wide enough to shift to any bit in a word. The offset stays between 0 and 63. The allocation rounds up to whole words and avoids adding 63 to bits, which could overflow for a very large input.</w:t>
+        <w:t xml:space="preserve">For a bit position p in the array, p / 64 selects the word and p % 64 selects the bit inside it. UINT64_C(1) provides an unsigned constant wide enough to shift to any bit in a word. The offset stays between 0 and 63. The allocation rounds up to whole words and avoids adding 63 to bits, which could overflow for a very large input.</w:t>
       </w:r>
     </w:p>
     <w:p>
@@ -1388,7 +1388,7 @@
         <w:pStyle w:val="Normal"/>
       </w:pPr>
       <w:r>
-        <w:t xml:space="preserve">The study began with three hypotheses. H1: with a fixed number of bits per key, increasing k should first lower the false-positive rate and then raise it, following the theoretical curve. H2: inserting more keys than the filter was designed for should increase false positives without causing false negatives. H3: filtering before an exact lookup should help when it rejects enough missing keys to save more time than the filter takes.</w:t>
+        <w:t xml:space="preserve">Here, n counts distinct inserted keys, m is the array size in bits, and k is the number of hash positions per key. The hypotheses are:</w:t>
       </w:r>
     </w:p>
     <w:p>
@@ -1396,7 +1396,7 @@
         <w:pStyle w:val="Normal"/>
       </w:pPr>
       <w:r>
-        <w:t xml:space="preserve">For n distinct keys in m bits, independent uniform hashing gives a probability of (1 − 1/m)^(kn) that a bit stays zero. The usual approximation for the false-positive rate is p ≈ (1 − exp(−kn/m))^k [1, 2]. It treats the queried bit values as approximately independent, so it predicts the rate rather than giving an exact value for this implementation.</w:t>
+        <w:t xml:space="preserve">H1: At a fixed bit budget per key, increasing k should first lower and then raise the false-positive rate. H2: Exceeding design capacity should increase false positives without rejecting inserted keys. H3: Filtering should reduce total query time when skipped exact-set lookups save more time than filtering costs.</w:t>
       </w:r>
     </w:p>
     <w:p>
@@ -1404,7 +1404,183 @@
         <w:pStyle w:val="Normal"/>
       </w:pPr>
       <w:r>
-        <w:t xml:space="preserve">Let b = m/n be the average bit budget per key. The hash count that minimises the approximate false-positive rate is k* ≈ b ln 2. With b = 10, this gives k* ≈ 6.93, so seven hashes are a reasonable choice for accuracy. The formula does not include the time spent calculating and checking those hashes.</w:t>
+        <w:t xml:space="preserve">With independent, uniform hashes, a particular bit stays zero with probability:</w:t>
+      </w:r>
+    </w:p>
+    <w:p>
+      <w:pPr>
+        <w:pStyle w:val="Normal"/>
+        <w:spacing w:after="100" w:line="240" w:lineRule="auto"/>
+        <w:jc w:val="center"/>
+      </w:pPr>
+      <m:oMathPara>
+        <m:oMath>
+          <m:sSub>
+            <m:e>
+              <m:r>
+                <m:t>P</m:t>
+              </m:r>
+            </m:e>
+            <m:sub>
+              <m:r>
+                <m:t>zero</m:t>
+              </m:r>
+            </m:sub>
+          </m:sSub>
+          <m:r>
+            <m:t> = </m:t>
+          </m:r>
+          <m:sSup>
+            <m:e>
+              <m:d>
+                <m:e>
+                  <m:r>
+                    <m:t>1 − </m:t>
+                  </m:r>
+                  <m:f>
+                    <m:num>
+                      <m:r>
+                        <m:t>1</m:t>
+                      </m:r>
+                    </m:num>
+                    <m:den>
+                      <m:r>
+                        <m:t>m</m:t>
+                      </m:r>
+                    </m:den>
+                  </m:f>
+                </m:e>
+              </m:d>
+            </m:e>
+            <m:sup>
+              <m:r>
+                <m:t>kn</m:t>
+              </m:r>
+            </m:sup>
+          </m:sSup>
+        </m:oMath>
+      </m:oMathPara>
+    </w:p>
+    <w:p>
+      <w:pPr>
+        <w:pStyle w:val="Normal"/>
+      </w:pPr>
+      <w:r>
+        <w:t xml:space="preserve">The usual approximation for the false-positive rate p is [1, 2]:</w:t>
+      </w:r>
+    </w:p>
+    <w:p>
+      <w:pPr>
+        <w:pStyle w:val="Normal"/>
+        <w:spacing w:after="100" w:line="240" w:lineRule="auto"/>
+        <w:jc w:val="center"/>
+      </w:pPr>
+      <m:oMathPara>
+        <m:oMath>
+          <m:r>
+            <m:t>p ≈ </m:t>
+          </m:r>
+          <m:sSup>
+            <m:e>
+              <m:d>
+                <m:e>
+                  <m:r>
+                    <m:t>1 − </m:t>
+                  </m:r>
+                  <m:sSup>
+                    <m:e>
+                      <m:r>
+                        <m:t>e</m:t>
+                      </m:r>
+                    </m:e>
+                    <m:sup>
+                      <m:r>
+                        <m:t>−</m:t>
+                      </m:r>
+                      <m:f>
+                        <m:num>
+                          <m:r>
+                            <m:t>kn</m:t>
+                          </m:r>
+                        </m:num>
+                        <m:den>
+                          <m:r>
+                            <m:t>m</m:t>
+                          </m:r>
+                        </m:den>
+                      </m:f>
+                    </m:sup>
+                  </m:sSup>
+                </m:e>
+              </m:d>
+            </m:e>
+            <m:sup>
+              <m:r>
+                <m:t>k</m:t>
+              </m:r>
+            </m:sup>
+          </m:sSup>
+        </m:oMath>
+      </m:oMathPara>
+    </w:p>
+    <w:p>
+      <w:pPr>
+        <w:pStyle w:val="Normal"/>
+      </w:pPr>
+      <w:r>
+        <w:t xml:space="preserve">This assumes approximately independent queried bits. Let b be bits per inserted key and k* the hash count that minimises the approximation:</w:t>
+      </w:r>
+    </w:p>
+    <w:p>
+      <w:pPr>
+        <w:pStyle w:val="Normal"/>
+        <w:spacing w:after="100" w:line="240" w:lineRule="auto"/>
+        <w:jc w:val="center"/>
+      </w:pPr>
+      <m:oMathPara>
+        <m:oMath>
+          <m:r>
+            <m:t>b = </m:t>
+          </m:r>
+          <m:f>
+            <m:num>
+              <m:r>
+                <m:t>m</m:t>
+              </m:r>
+            </m:num>
+            <m:den>
+              <m:r>
+                <m:t>n</m:t>
+              </m:r>
+            </m:den>
+          </m:f>
+          <m:r>
+            <m:t> ,     </m:t>
+          </m:r>
+          <m:sSup>
+            <m:e>
+              <m:r>
+                <m:t>k</m:t>
+              </m:r>
+            </m:e>
+            <m:sup>
+              <m:r>
+                <m:t>*</m:t>
+              </m:r>
+            </m:sup>
+          </m:sSup>
+          <m:r>
+            <m:t> ≈ b ln 2</m:t>
+          </m:r>
+        </m:oMath>
+      </m:oMathPara>
+    </w:p>
+    <w:p>
+      <w:pPr>
+        <w:pStyle w:val="Normal"/>
+      </w:pPr>
+      <w:r>
+        <w:t xml:space="preserve">At 10 bits per key, k* is about 6.93. Seven hashes therefore targets low error; the formula does not optimise query time.</w:t>
       </w:r>
     </w:p>
     <w:tbl>
@@ -1925,7 +2101,7 @@
                 <w:sz w:val="20"/>
                 <w:color w:val="FFFFFF"/>
               </w:rPr>
-              <w:t xml:space="preserve">FPR at that k</w:t>
+              <w:t xml:space="preserve">False-positive rate</w:t>
             </w:r>
           </w:p>
         </w:tc>
@@ -4047,31 +4223,200 @@
         <w:pStyle w:val="Normal"/>
       </w:pPr>
       <w:r>
-        <w:t xml:space="preserve">Let q be the fraction of queries for absent keys and p the false-positive rate. The fraction reaching the exact set is approximately r = (1 − q) + qp: all present keys and the false positives need an exact check. If each set lookup costs an extra L, then Tset(L) = Tset(0) + L and Tfiltered(L) = Tfiltered(0) + rL. For r &lt; 1, the extra cost at which the methods take equal time is L* = (Tfiltered(0) − Tset(0))/(1 − r).</w:t>
+        <w:t xml:space="preserve">Let q be the fraction of queries for absent keys and p the false-positive rate. The fraction r that reaches the exact set is approximately:</w:t>
       </w:r>
     </w:p>
     <w:p>
       <w:pPr>
         <w:pStyle w:val="Normal"/>
-      </w:pPr>
-      <w:r>
-        <w:t xml:space="preserve">For n = 20,000, k = 7 and all queries absent, the original paired timings give L* values between 11.18 and 12.17 ns across seeds. This estimates how much extra lookup cost would make filtering worthwhile. It assumes the same extra cost for every set lookup; real databases or networks may behave differently because of caching, batching, concurrency and different costs for hits and misses.</w:t>
-      </w:r>
+        <w:spacing w:after="100" w:line="240" w:lineRule="auto"/>
+        <w:jc w:val="center"/>
+      </w:pPr>
+      <m:oMathPara>
+        <m:oMath>
+          <m:r>
+            <m:t>r ≈ (1 − q) + qp</m:t>
+          </m:r>
+        </m:oMath>
+      </m:oMathPara>
     </w:p>
     <w:p>
       <w:pPr>
         <w:pStyle w:val="Normal"/>
       </w:pPr>
       <w:r>
-        <w:t xml:space="preserve">Both runs used an Apple M2 with 8 GB memory, macOS 14.4.1 and Apple Clang 15, compiling C++17 with -O3. CPU affinity, power state and background activity were not controlled. The tests use warmed-up queries, two set sizes and uniform integer keys. They do not cover cold storage, skewed queries or adversarial inputs. Data generation and filtering also share the same mixer family.</w:t>
+        <w:t xml:space="preserve">All present keys and the false positives require a set lookup. Let L be an extra cost per set lookup, and let T denote average time per input query. The subscripts identify set-only lookup and Bloom followed by the set. Using the measured times at L = 0:</w:t>
       </w:r>
     </w:p>
     <w:p>
       <w:pPr>
         <w:pStyle w:val="Normal"/>
-      </w:pPr>
-      <w:r>
-        <w:t xml:space="preserve">Construction was measured separately and is excluded from query speedups. Each set-build time is one observation copied across the relevant k rows in the memory CSV, not a new measurement in each row. The performance comparison therefore concerns repeated lookups after the structures have been built.</w:t>
+        <w:spacing w:after="100" w:line="240" w:lineRule="auto"/>
+        <w:jc w:val="center"/>
+      </w:pPr>
+      <m:oMathPara>
+        <m:oMath>
+          <m:sSub>
+            <m:e>
+              <m:r>
+                <m:t>T</m:t>
+              </m:r>
+            </m:e>
+            <m:sub>
+              <m:r>
+                <m:t>set</m:t>
+              </m:r>
+            </m:sub>
+          </m:sSub>
+          <m:r>
+            <m:t>(L) = </m:t>
+          </m:r>
+          <m:sSub>
+            <m:e>
+              <m:r>
+                <m:t>T</m:t>
+              </m:r>
+            </m:e>
+            <m:sub>
+              <m:r>
+                <m:t>set</m:t>
+              </m:r>
+            </m:sub>
+          </m:sSub>
+          <m:r>
+            <m:t>(0) + L</m:t>
+          </m:r>
+          <m:r>
+            <m:t> ,     </m:t>
+          </m:r>
+          <m:sSub>
+            <m:e>
+              <m:r>
+                <m:t>T</m:t>
+              </m:r>
+            </m:e>
+            <m:sub>
+              <m:r>
+                <m:t>filtered</m:t>
+              </m:r>
+            </m:sub>
+          </m:sSub>
+          <m:r>
+            <m:t>(L) = </m:t>
+          </m:r>
+          <m:sSub>
+            <m:e>
+              <m:r>
+                <m:t>T</m:t>
+              </m:r>
+            </m:e>
+            <m:sub>
+              <m:r>
+                <m:t>filtered</m:t>
+              </m:r>
+            </m:sub>
+          </m:sSub>
+          <m:r>
+            <m:t>(0) + rL</m:t>
+          </m:r>
+        </m:oMath>
+      </m:oMathPara>
+    </w:p>
+    <w:p>
+      <w:pPr>
+        <w:pStyle w:val="Normal"/>
+      </w:pPr>
+      <w:r>
+        <w:t xml:space="preserve">For r &lt; 1, the extra cost L* at which both methods take equal time is:</w:t>
+      </w:r>
+    </w:p>
+    <w:p>
+      <w:pPr>
+        <w:pStyle w:val="Normal"/>
+        <w:spacing w:after="100" w:line="240" w:lineRule="auto"/>
+        <w:jc w:val="center"/>
+      </w:pPr>
+      <m:oMathPara>
+        <m:oMath>
+          <m:sSup>
+            <m:e>
+              <m:r>
+                <m:t>L</m:t>
+              </m:r>
+            </m:e>
+            <m:sup>
+              <m:r>
+                <m:t>*</m:t>
+              </m:r>
+            </m:sup>
+          </m:sSup>
+          <m:r>
+            <m:t> = </m:t>
+          </m:r>
+          <m:f>
+            <m:num>
+              <m:sSub>
+                <m:e>
+                  <m:r>
+                    <m:t>T</m:t>
+                  </m:r>
+                </m:e>
+                <m:sub>
+                  <m:r>
+                    <m:t>filtered</m:t>
+                  </m:r>
+                </m:sub>
+              </m:sSub>
+              <m:r>
+                <m:t>(0) − </m:t>
+              </m:r>
+              <m:sSub>
+                <m:e>
+                  <m:r>
+                    <m:t>T</m:t>
+                  </m:r>
+                </m:e>
+                <m:sub>
+                  <m:r>
+                    <m:t>set</m:t>
+                  </m:r>
+                </m:sub>
+              </m:sSub>
+              <m:r>
+                <m:t>(0)</m:t>
+              </m:r>
+            </m:num>
+            <m:den>
+              <m:r>
+                <m:t>1 − r</m:t>
+              </m:r>
+            </m:den>
+          </m:f>
+        </m:oMath>
+      </m:oMathPara>
+    </w:p>
+    <w:p>
+      <w:pPr>
+        <w:pStyle w:val="Normal"/>
+      </w:pPr>
+      <w:r>
+        <w:t xml:space="preserve">For 20,000 keys, seven hashes and all queries absent, the original paired timings give break-even costs of 11.18–12.17 ns across seeds. The model assumes equal extra cost per set lookup. Real databases may differ because of caching, batching, concurrency and different costs for hits and misses.</w:t>
+      </w:r>
+    </w:p>
+    <w:p>
+      <w:pPr>
+        <w:pStyle w:val="Normal"/>
+      </w:pPr>
+      <w:r>
+        <w:t xml:space="preserve">Both runs used an Apple M2 with 8 GB memory, macOS 14.4.1 and Apple Clang 15 with -O3. Processor assignment, power state and background activity were uncontrolled. Tests cover warmed-up queries, two set sizes and uniform integer keys, excluding cold storage, skewed queries and adversarial inputs. Data generation and filtering share the same mixer family.</w:t>
+      </w:r>
+    </w:p>
+    <w:p>
+      <w:pPr>
+        <w:pStyle w:val="Normal"/>
+      </w:pPr>
+      <w:r>
+        <w:t xml:space="preserve">Construction is excluded from query speedups. Each set-build time is one observation repeated across the relevant k rows in the memory CSV. The comparison concerns repeated lookups after construction.</w:t>
       </w:r>
     </w:p>
     <w:p>

</xml_diff>

<commit_message>
Refocus empirical study on Bloom filter theory and follow-up speed
</commit_message>
<xml_diff>
--- a/docs/Bloom_Filter_Report.docx
+++ b/docs/Bloom_Filter_Report.docx
@@ -690,7 +690,7 @@
       </w:pPr>
       <w:hyperlink w:anchor="study_6">
         <w:r>
-          <w:t xml:space="preserve">2.5 Exact lookup performance</w:t>
+          <w:t xml:space="preserve">2.5 Does lower error mean faster lookup?</w:t>
         </w:r>
       </w:hyperlink>
       <w:r>
@@ -756,7 +756,7 @@
       </w:pPr>
       <w:hyperlink w:anchor="study_9">
         <w:r>
-          <w:t xml:space="preserve">2.7.1 Results and scope</w:t>
+          <w:t xml:space="preserve">2.8 Interpretation and limits</w:t>
         </w:r>
       </w:hyperlink>
       <w:r>
@@ -778,7 +778,7 @@
       </w:pPr>
       <w:hyperlink w:anchor="study_10">
         <w:r>
-          <w:t xml:space="preserve">2.8 Interpretation and limits</w:t>
+          <w:t xml:space="preserve">2.9 Choosing a configuration</w:t>
         </w:r>
       </w:hyperlink>
       <w:r>
@@ -800,7 +800,7 @@
       </w:pPr>
       <w:hyperlink w:anchor="study_11">
         <w:r>
-          <w:t xml:space="preserve">2.9 Choosing a configuration</w:t>
+          <w:t xml:space="preserve">3 What I learned</w:t>
         </w:r>
       </w:hyperlink>
       <w:r>
@@ -822,7 +822,7 @@
       </w:pPr>
       <w:hyperlink w:anchor="study_12">
         <w:r>
-          <w:t xml:space="preserve">3 What I learned</w:t>
+          <w:t xml:space="preserve">3.4 Evidence changed the way results were judged</w:t>
         </w:r>
       </w:hyperlink>
       <w:r>
@@ -844,7 +844,7 @@
       </w:pPr>
       <w:hyperlink w:anchor="study_13">
         <w:r>
-          <w:t xml:space="preserve">3.4 Evidence changed the way results were judged</w:t>
+          <w:t xml:space="preserve">4 AI use</w:t>
         </w:r>
       </w:hyperlink>
       <w:r>
@@ -866,7 +866,7 @@
       </w:pPr>
       <w:hyperlink w:anchor="study_14">
         <w:r>
-          <w:t xml:space="preserve">4 AI use</w:t>
+          <w:t xml:space="preserve">References</w:t>
         </w:r>
       </w:hyperlink>
       <w:r>
@@ -875,28 +875,6 @@
       <w:fldSimple w:instr=" PAGEREF study_14 \h ">
         <w:r>
           <w:t xml:space="preserve">17</w:t>
-        </w:r>
-      </w:fldSimple>
-    </w:p>
-    <w:p>
-      <w:pPr>
-        <w:pStyle w:val="TOC1"/>
-        <w:spacing w:after="100" w:line="240" w:lineRule="auto"/>
-        <w:tabs>
-          <w:tab w:val="right" w:pos="8500" w:leader="dot"/>
-        </w:tabs>
-      </w:pPr>
-      <w:hyperlink w:anchor="study_15">
-        <w:r>
-          <w:t xml:space="preserve">References</w:t>
-        </w:r>
-      </w:hyperlink>
-      <w:r>
-        <w:tab/>
-      </w:r>
-      <w:fldSimple w:instr=" PAGEREF study_15 \h ">
-        <w:r>
-          <w:t xml:space="preserve">18</w:t>
         </w:r>
       </w:fldSimple>
     </w:p>
@@ -1380,7 +1358,7 @@
         <w:ind w:left="0" w:hanging="0"/>
       </w:pPr>
       <w:r>
-        <w:t xml:space="preserve">2.1 Questions and initial hypotheses</w:t>
+        <w:t xml:space="preserve">2.1 Main question and theoretical prediction</w:t>
       </w:r>
     </w:p>
     <w:p>
@@ -1388,7 +1366,7 @@
         <w:pStyle w:val="Normal"/>
       </w:pPr>
       <w:r>
-        <w:t xml:space="preserve">Here, n counts distinct inserted keys, m is the array size in bits, and k is the number of hash positions per key. The hypotheses are:</w:t>
+        <w:t xml:space="preserve">The main question is how closely measured false-positive rates follow theory as the hash count and inserted-key count change. Here, n counts distinct inserted keys, m is the array size in bits, and k is the number of hash positions per key.</w:t>
       </w:r>
     </w:p>
     <w:p>
@@ -1396,7 +1374,7 @@
         <w:pStyle w:val="Normal"/>
       </w:pPr>
       <w:r>
-        <w:t xml:space="preserve">H1: At a fixed bit budget per key, increasing k should first lower and then raise the false-positive rate. H2: Exceeding design capacity should increase false positives without rejecting inserted keys. H3: Filtering should reduce total query time when skipped exact-set lookups save more time than filtering costs.</w:t>
+        <w:t xml:space="preserve">The hypothesis is that measured rates follow the predicted curve: increasing k first lowers and then raises the rate, while adding keys to a fixed filter raises it. Checking that inserted keys are never rejected tests implementation correctness.</w:t>
       </w:r>
     </w:p>
     <w:p>
@@ -1580,7 +1558,7 @@
         <w:pStyle w:val="Normal"/>
       </w:pPr>
       <w:r>
-        <w:t xml:space="preserve">At 10 bits per key, k* is about 6.93. Seven hashes therefore targets low error; the formula does not optimise query time.</w:t>
+        <w:t xml:space="preserve">At 10 bits per key, k* is about 6.93. A follow-up asks whether the lowest-error choice also gives the fastest exact lookup.</w:t>
       </w:r>
     </w:p>
     <w:tbl>
@@ -1826,63 +1804,6 @@
                 <w:color w:val="000000"/>
               </w:rPr>
               <w:t xml:space="preserve">n ∈ {20,000, 200,000}; b = 10; k ∈ {1, 3, 7, 11}</w:t>
-            </w:r>
-          </w:p>
-        </w:tc>
-      </w:tr>
-      <w:tr>
-        <w:trPr>
-          <w:cantSplit/>
-        </w:trPr>
-        <w:tc>
-          <w:tcPr>
-            <w:tcW w:w="3800" w:type="dxa"/>
-            <w:vAlign w:val="center"/>
-            <w:shd w:fill="FFFFFF"/>
-            <w:tcMar>
-              <w:top w:w="90" w:type="dxa"/>
-              <w:left w:w="90" w:type="dxa"/>
-              <w:bottom w:w="90" w:type="dxa"/>
-              <w:right w:w="90" w:type="dxa"/>
-            </w:tcMar>
-          </w:tcPr>
-          <w:p>
-            <w:pPr>
-              <w:pStyle w:val="Normal"/>
-              <w:spacing w:after="100" w:line="240" w:lineRule="auto"/>
-            </w:pPr>
-            <w:r>
-              <w:rPr>
-                <w:sz w:val="20"/>
-                <w:color w:val="000000"/>
-              </w:rPr>
-              <w:t xml:space="preserve">Query mix</w:t>
-            </w:r>
-          </w:p>
-        </w:tc>
-        <w:tc>
-          <w:tcPr>
-            <w:tcW w:w="4700" w:type="dxa"/>
-            <w:vAlign w:val="center"/>
-            <w:shd w:fill="FFFFFF"/>
-            <w:tcMar>
-              <w:top w:w="90" w:type="dxa"/>
-              <w:left w:w="90" w:type="dxa"/>
-              <w:bottom w:w="90" w:type="dxa"/>
-              <w:right w:w="90" w:type="dxa"/>
-            </w:tcMar>
-          </w:tcPr>
-          <w:p>
-            <w:pPr>
-              <w:pStyle w:val="Normal"/>
-              <w:spacing w:after="100" w:line="240" w:lineRule="auto"/>
-            </w:pPr>
-            <w:r>
-              <w:rPr>
-                <w:sz w:val="20"/>
-                <w:color w:val="000000"/>
-              </w:rPr>
-              <w:t xml:space="preserve">Absent fractions 0%, 50%, 90%, 100%</w:t>
             </w:r>
           </w:p>
         </w:tc>
@@ -2847,7 +2768,7 @@
         <w:pStyle w:val="Normal"/>
       </w:pPr>
       <w:r>
-        <w:t xml:space="preserve">At one quarter of capacity, only three false positives occurred in 1.6 million absent queries. There are too few errors to estimate this small probability precisely.</w:t>
+        <w:t xml:space="preserve">Together, the hash-count and capacity curves broadly follow theory. At one quarter of capacity, however, only three false positives occurred in 1.6 million absent queries, too few to estimate this small probability precisely.</w:t>
       </w:r>
     </w:p>
     <w:tbl>
@@ -3118,7 +3039,7 @@
       </w:pPr>
       <w:bookmarkStart w:id="3006" w:name="study_6"/>
       <w:r>
-        <w:t xml:space="preserve">2.5 Exact lookup performance</w:t>
+        <w:t xml:space="preserve">2.5 Does lower error mean faster lookup?</w:t>
       </w:r>
       <w:bookmarkEnd w:id="3006"/>
     </w:p>
@@ -3617,7 +3538,7 @@
         <w:spacing w:before="140"/>
       </w:pPr>
       <w:r>
-        <w:t xml:space="preserve">Seven hashes gave a low error rate but did not consistently make exact lookup faster. With 20,000 keys and all queries absent, its speedup was 0.713 ± 0.021, meaning it was slower than the set alone. One hash gave 2.871 ± 0.357. Although it allowed more false positives, it took less time to check and still rejected most absent keys.</w:t>
+        <w:t xml:space="preserve">The follow-up compares the low-error choice with faster-to-check settings. Seven hashes did not consistently make exact lookup faster. With 20,000 keys and all queries absent, its speedup was 0.713 ± 0.021, meaning it was slower than the set alone. One hash gave 2.871 ± 0.357. Although it allowed more false positives, it took less time to check and still rejected most absent keys.</w:t>
       </w:r>
     </w:p>
     <w:p>
@@ -3700,7 +3621,7 @@
         <w:pStyle w:val="Normal"/>
       </w:pPr>
       <w:r>
-        <w:t xml:space="preserve">In the main experiment, Bloom queries for absent keys took longer than queries for present keys, even though they could stop early. A separate experiment compared early exit with a version that checks all k positions, called a full scan. The full scan used a separate word array with the same contents and positions. Each setting used four seeds and seven timed repetitions. Bit checks were counted outside timing.</w:t>
+        <w:t xml:space="preserve">The timing study raised an unexpected question: why did absent queries take longer even though they could stop early? A diagnostic compared early exit with full scanning using a separate array with identical bits and positions. It used four seeds and seven repetitions; bit checks were counted outside timing.</w:t>
       </w:r>
     </w:p>
     <w:p>
@@ -3716,7 +3637,7 @@
         <w:pStyle w:val="Normal"/>
       </w:pPr>
       <w:r>
-        <w:t xml:space="preserve">Branches and compiler-generated code may explain the difference, but no branch counters or assembly analysis were collected. The two arrays also had different memory addresses. The next experiment removes that storage difference and compares both versions as part of exact lookup. Its timings are reported separately from this run.</w:t>
+        <w:t xml:space="preserve">This suggested that fewer bit checks did not guarantee lower runtime. Branches and compiler output are possible explanations, but no hardware counters or assembly analysis were collected. Because the arrays had different addresses, the next comparison uses the same Bloom object and measures the complete lookup process. The two runs remain separate.</w:t>
       </w:r>
     </w:p>
     <w:p>
@@ -3791,15 +3712,7 @@
         <w:pStyle w:val="Normal"/>
       </w:pPr>
       <w:r>
-        <w:t xml:space="preserve">The next experiment uses contains and contains_full_scan on the same Bloom object, followed by the same exact set. Both versions read the same bits and send the same queries to the set. Full scanning uses &amp;= to combine all bit checks without an early return. Before timing, both versions are checked against the exact set for every query.</w:t>
-      </w:r>
-    </w:p>
-    <w:p>
-      <w:pPr>
-        <w:pStyle w:val="Normal"/>
-      </w:pPr>
-      <w:r>
-        <w:t xml:space="preserve">The experiment uses two set sizes, k = 1 or 7, four absent-query proportions and four seeds. Each method has seven repetitions of 200,000 queries, giving 1,344 timing rows. Data generation and validation stay outside timing. Methods are warmed up and run in random order. Analysis uses the same seed-median and paired-ratio method as before. With k = 1, both query versions check just one bit, providing a useful control.</w:t>
+        <w:t xml:space="preserve">The final timing check uses contains and contains_full_scan on the same Bloom object and exact set. Both answers are verified per key. It tests two set sizes, k = 1 or 7, four query mixes and four seeds, with seven repetitions of 200,000 queries. The timing and analysis procedure follows Section 2.2, giving 1,344 rows.</w:t>
       </w:r>
     </w:p>
     <w:tbl>
@@ -4158,6 +4071,23 @@
     </w:tbl>
     <w:p>
       <w:pPr>
+        <w:pStyle w:val="Normal"/>
+        <w:spacing w:before="140"/>
+      </w:pPr>
+      <w:r>
+        <w:t xml:space="preserve">With all queries absent, full scanning is 1.812 ± 0.034 times as fast as early exit. It also beats the set alone at both sizes. At 50% absent, however, its speed relative to early exit is 0.859 ± 0.006, so it is slower. At 90% absent, its interval relative to the set includes 1.</w:t>
+      </w:r>
+    </w:p>
+    <w:p>
+      <w:pPr>
+        <w:pStyle w:val="Normal"/>
+      </w:pPr>
+      <w:r>
+        <w:t xml:space="preserve">One hash still gives the fastest tested all-absent lookup: its speedup at 200,000 keys is 2.726 ± 0.055. Thus, improving the seven-hash code does not change the answer to the follow-up question: lowest error does not imply fastest lookup. The one-hash control shows much smaller differences between query versions, but these measurements do not identify a hardware cause. Configuration order was fixed on an active desktop.</w:t>
+      </w:r>
+    </w:p>
+    <w:p>
+      <w:pPr>
         <w:pStyle w:val="Heading2"/>
         <w:numPr>
           <w:numId w:val="0"/>
@@ -4167,56 +4097,9 @@
       </w:pPr>
       <w:bookmarkStart w:id="3009" w:name="study_9"/>
       <w:r>
-        <w:t xml:space="preserve">2.7.1 Results and scope</w:t>
+        <w:t xml:space="preserve">2.8 Interpretation and limits</w:t>
       </w:r>
       <w:bookmarkEnd w:id="3009"/>
-    </w:p>
-    <w:p>
-      <w:pPr>
-        <w:pStyle w:val="Normal"/>
-      </w:pPr>
-      <w:r>
-        <w:t xml:space="preserve">With 200,000 keys, k = 7 and all queries absent, full scanning makes the exact pipeline 1.812 ± 0.034 times as fast as early exit. Compared with the set alone, the speedup is 1.282 ± 0.098 for full scanning and 0.707 ± 0.041 for early exit. Full scanning therefore improves the whole lookup process in this setting, not only the filter by itself.</w:t>
-      </w:r>
-    </w:p>
-    <w:p>
-      <w:pPr>
-        <w:pStyle w:val="Normal"/>
-      </w:pPr>
-      <w:r>
-        <w:t xml:space="preserve">The result changes with the queries. When half are absent, the full-scan/early-exit speed ratio is 0.859 ± 0.006, so full scanning is slower. With 90% absent queries, its speedup over the set alone is 1.011 ± 0.028. That interval includes 1, so there is no clear advantage over the set in this case.</w:t>
-      </w:r>
-    </w:p>
-    <w:p>
-      <w:pPr>
-        <w:pStyle w:val="Normal"/>
-      </w:pPr>
-      <w:r>
-        <w:t xml:space="preserve">For the smaller set, full scanning with k = 7 also helps when all queries are absent: its speedup over the set alone is 1.217 ± 0.009. However, one hash with early exit remains faster in the 200,000-key, all-absent test, with a speedup of 2.726 ± 0.055. Improving the seven-hash version does not make it the fastest tested setting.</w:t>
-      </w:r>
-    </w:p>
-    <w:p>
-      <w:pPr>
-        <w:pStyle w:val="Normal"/>
-      </w:pPr>
-      <w:r>
-        <w:t xml:space="preserve">Using one Bloom object removes the different array addresses from the earlier comparison. With k = 1, the timing differences between versions are much smaller than with k = 7 when most queries are absent. However, the experiment does not separate the effects of branches, vectorisation or instruction scheduling. It uses four seeds, a fixed order of configurations and an active desktop machine.</w:t>
-      </w:r>
-    </w:p>
-    <w:p>
-      <w:pPr>
-        <w:pStyle w:val="Heading2"/>
-        <w:numPr>
-          <w:numId w:val="0"/>
-        </w:numPr>
-        <w:ind w:left="0" w:hanging="0"/>
-        <w:pageBreakBefore/>
-      </w:pPr>
-      <w:bookmarkStart w:id="3010" w:name="study_10"/>
-      <w:r>
-        <w:t xml:space="preserve">2.8 Interpretation and limits</w:t>
-      </w:r>
-      <w:bookmarkEnd w:id="3010"/>
     </w:p>
     <w:p>
       <w:pPr>
@@ -4428,18 +4311,18 @@
         <w:ind w:left="0" w:hanging="0"/>
         <w:pageBreakBefore/>
       </w:pPr>
-      <w:bookmarkStart w:id="3011" w:name="study_11"/>
+      <w:bookmarkStart w:id="3010" w:name="study_10"/>
       <w:r>
         <w:t xml:space="preserve">2.9 Choosing a configuration</w:t>
       </w:r>
-      <w:bookmarkEnd w:id="3011"/>
+      <w:bookmarkEnd w:id="3010"/>
     </w:p>
     <w:p>
       <w:pPr>
         <w:pStyle w:val="Normal"/>
       </w:pPr>
       <w:r>
-        <w:t xml:space="preserve">Choose the setting based on the answer guarantee and the work it needs to save. If false positives are acceptable, select m and k for the error target. If answers must be exact, keep the set and measure the combined query time. In that case, the filter uses extra memory to avoid some set lookups.</w:t>
+        <w:t xml:space="preserve">The main study supports using the theoretical curve to choose a starting configuration for accuracy. The timing follow-up shows why that choice also needs measurement when speed matters. If false positives are acceptable, select m and k for the error target. If answers must be exact, keep the set and measure the combined query time. In that case, the filter uses extra memory to avoid some set lookups.</w:t>
       </w:r>
     </w:p>
     <w:tbl>
@@ -4822,11 +4705,11 @@
         <w:ind w:left="0" w:hanging="0"/>
         <w:pageBreakBefore/>
       </w:pPr>
-      <w:bookmarkStart w:id="3012" w:name="study_12"/>
+      <w:bookmarkStart w:id="3011" w:name="study_11"/>
       <w:r>
         <w:t xml:space="preserve">3 What I learned</w:t>
       </w:r>
-      <w:bookmarkEnd w:id="3012"/>
+      <w:bookmarkEnd w:id="3011"/>
     </w:p>
     <w:p>
       <w:pPr>
@@ -4897,11 +4780,11 @@
         <w:ind w:left="0" w:hanging="0"/>
         <w:pageBreakBefore/>
       </w:pPr>
-      <w:bookmarkStart w:id="3013" w:name="study_13"/>
+      <w:bookmarkStart w:id="3012" w:name="study_12"/>
       <w:r>
         <w:t xml:space="preserve">3.4 Evidence changed the way results were judged</w:t>
       </w:r>
-      <w:bookmarkEnd w:id="3013"/>
+      <w:bookmarkEnd w:id="3012"/>
     </w:p>
     <w:p>
       <w:pPr>
@@ -4936,11 +4819,11 @@
         <w:ind w:left="0" w:hanging="0"/>
         <w:pageBreakBefore/>
       </w:pPr>
-      <w:bookmarkStart w:id="3014" w:name="study_14"/>
+      <w:bookmarkStart w:id="3013" w:name="study_13"/>
       <w:r>
         <w:t xml:space="preserve">4 AI use</w:t>
       </w:r>
-      <w:bookmarkEnd w:id="3014"/>
+      <w:bookmarkEnd w:id="3013"/>
     </w:p>
     <w:p>
       <w:pPr>
@@ -4983,11 +4866,11 @@
         <w:ind w:left="0" w:hanging="0"/>
         <w:pageBreakBefore/>
       </w:pPr>
-      <w:bookmarkStart w:id="3015" w:name="study_15"/>
+      <w:bookmarkStart w:id="3014" w:name="study_14"/>
       <w:r>
         <w:t xml:space="preserve">References</w:t>
       </w:r>
-      <w:bookmarkEnd w:id="3015"/>
+      <w:bookmarkEnd w:id="3014"/>
     </w:p>
     <w:p>
       <w:pPr>

</xml_diff>

<commit_message>
Split accuracy figures by report section
</commit_message>
<xml_diff>
--- a/docs/Bloom_Filter_Report.docx
+++ b/docs/Bloom_Filter_Report.docx
@@ -1879,14 +1879,14 @@
       <w:r>
         <w:drawing>
           <wp:inline distT="0" distB="0" distL="0" distR="0">
-            <wp:extent cx="5350000" cy="1945454"/>
+            <wp:extent cx="4200000" cy="3056603"/>
             <wp:docPr id="101" name="Study figure 1"/>
             <wp:cNvGraphicFramePr/>
             <a:graphic>
               <a:graphicData uri="http://schemas.openxmlformats.org/drawingml/2006/picture">
                 <pic:pic>
                   <pic:nvPicPr>
-                    <pic:cNvPr id="0" name="accuracy.png"/>
+                    <pic:cNvPr id="0" name="accuracy_hash.png"/>
                     <pic:cNvPicPr/>
                   </pic:nvPicPr>
                   <pic:blipFill>
@@ -1898,7 +1898,7 @@
                   <pic:spPr>
                     <a:xfrm>
                       <a:off x="0" y="0"/>
-                      <a:ext cx="5350000" cy="1945454"/>
+                      <a:ext cx="4200000" cy="3056603"/>
                     </a:xfrm>
                     <a:prstGeom prst="rect">
                       <a:avLst/>
@@ -1920,7 +1920,7 @@
         <w:rPr>
           <w:sz w:val="20"/>
         </w:rPr>
-        <w:t xml:space="preserve">Figure 1. Left: mean false-positive rates across eight seeds, with 95% intervals and theoretical curves. Right: the effect of inserting more keys into a fixed-size filter. Some error bars are too small to see.</w:t>
+        <w:t xml:space="preserve">Figure 1. Mean false-positive rates across eight seeds, with 95% intervals and theoretical curves. Some error bars are too small to see.</w:t>
       </w:r>
     </w:p>
     <w:tbl>
@@ -2392,6 +2392,58 @@
       </w:r>
       <w:bookmarkEnd w:id="3005"/>
     </w:p>
+    <w:p xmlns:a="http://schemas.openxmlformats.org/drawingml/2006/main" xmlns:pic="http://schemas.openxmlformats.org/drawingml/2006/picture">
+      <w:pPr>
+        <w:keepNext/>
+        <w:spacing w:after="0" w:line="240" w:lineRule="auto"/>
+      </w:pPr>
+      <w:r>
+        <w:drawing>
+          <wp:inline distT="0" distB="0" distL="0" distR="0">
+            <wp:extent cx="3500000" cy="2543741"/>
+            <wp:docPr id="102" name="Study figure 2"/>
+            <wp:cNvGraphicFramePr/>
+            <a:graphic>
+              <a:graphicData uri="http://schemas.openxmlformats.org/drawingml/2006/picture">
+                <pic:pic>
+                  <pic:nvPicPr>
+                    <pic:cNvPr id="0" name="accuracy_capacity.png"/>
+                    <pic:cNvPicPr/>
+                  </pic:nvPicPr>
+                  <pic:blipFill>
+                    <a:blip r:embed="rIdStudy2"/>
+                    <a:stretch>
+                      <a:fillRect/>
+                    </a:stretch>
+                  </pic:blipFill>
+                  <pic:spPr>
+                    <a:xfrm>
+                      <a:off x="0" y="0"/>
+                      <a:ext cx="3500000" cy="2543741"/>
+                    </a:xfrm>
+                    <a:prstGeom prst="rect">
+                      <a:avLst/>
+                    </a:prstGeom>
+                  </pic:spPr>
+                </pic:pic>
+              </a:graphicData>
+            </a:graphic>
+          </wp:inline>
+        </w:drawing>
+      </w:r>
+    </w:p>
+    <w:p>
+      <w:pPr>
+        <w:pStyle w:val="Normal"/>
+        <w:spacing w:after="100" w:line="240" w:lineRule="auto"/>
+      </w:pPr>
+      <w:r>
+        <w:rPr>
+          <w:sz w:val="20"/>
+        </w:rPr>
+        <w:t xml:space="preserve">Figure 2. False-positive rate as more keys are inserted into a fixed-size filter with k = 7. Some error bars are too small to see.</w:t>
+      </w:r>
+    </w:p>
     <w:tbl>
       <w:tblPr>
         <w:tblW w:w="8500" w:type="dxa"/>
@@ -2771,6 +2823,18 @@
         <w:t xml:space="preserve">Together, the hash-count and capacity curves broadly follow theory. At one quarter of capacity, however, only three false positives occurred in 1.6 million absent queries, too few to estimate this small probability precisely.</w:t>
       </w:r>
     </w:p>
+    <w:p>
+      <w:pPr>
+        <w:pStyle w:val="Heading2"/>
+        <w:numPr>
+          <w:numId w:val="0"/>
+        </w:numPr>
+        <w:ind w:left="0" w:hanging="0"/>
+      </w:pPr>
+      <w:r>
+        <w:t xml:space="preserve">Storage comparison</w:t>
+      </w:r>
+    </w:p>
     <w:tbl>
       <w:tblPr>
         <w:tblW w:w="8500" w:type="dxa"/>
@@ -3052,7 +3116,7 @@
         <w:drawing>
           <wp:inline distT="0" distB="0" distL="0" distR="0">
             <wp:extent cx="5350000" cy="1945454"/>
-            <wp:docPr id="102" name="Study figure 2"/>
+            <wp:docPr id="103" name="Study figure 3"/>
             <wp:cNvGraphicFramePr/>
             <a:graphic>
               <a:graphicData uri="http://schemas.openxmlformats.org/drawingml/2006/picture">
@@ -3062,7 +3126,7 @@
                     <pic:cNvPicPr/>
                   </pic:nvPicPr>
                   <pic:blipFill>
-                    <a:blip r:embed="rIdStudy2"/>
+                    <a:blip r:embed="rIdStudy3"/>
                     <a:stretch>
                       <a:fillRect/>
                     </a:stretch>
@@ -3092,7 +3156,7 @@
         <w:rPr>
           <w:sz w:val="20"/>
         </w:rPr>
-        <w:t xml:space="preserve">Figure 2. Set-only query time divided by filter-plus-set query time. A value above 1 means the filter speeds up exact lookup. Error bars show 95% intervals across four paired seed ratios.</w:t>
+        <w:t xml:space="preserve">Figure 3. Set-only query time divided by filter-plus-set query time. A value above 1 means the filter speeds up exact lookup. Error bars show 95% intervals across four paired seed ratios.</w:t>
       </w:r>
     </w:p>
     <w:tbl>
@@ -3573,7 +3637,7 @@
         <w:drawing>
           <wp:inline distT="0" distB="0" distL="0" distR="0">
             <wp:extent cx="5350000" cy="1945454"/>
-            <wp:docPr id="103" name="Study figure 3"/>
+            <wp:docPr id="104" name="Study figure 4"/>
             <wp:cNvGraphicFramePr/>
             <a:graphic>
               <a:graphicData uri="http://schemas.openxmlformats.org/drawingml/2006/picture">
@@ -3583,7 +3647,7 @@
                     <pic:cNvPicPr/>
                   </pic:nvPicPr>
                   <pic:blipFill>
-                    <a:blip r:embed="rIdStudy3"/>
+                    <a:blip r:embed="rIdStudy4"/>
                     <a:stretch>
                       <a:fillRect/>
                     </a:stretch>
@@ -3613,7 +3677,7 @@
         <w:rPr>
           <w:sz w:val="20"/>
         </w:rPr>
-        <w:t xml:space="preserve">Figure 3. Early exit compared with full scanning at k = 7. Both give the same result for every checked query. Bars show the mean of the seed medians, with 95% intervals.</w:t>
+        <w:t xml:space="preserve">Figure 4. Early exit compared with full scanning at k = 7. Both give the same result for every checked query. Bars show the mean of the seed medians, with 95% intervals.</w:t>
       </w:r>
     </w:p>
     <w:p>
@@ -3664,7 +3728,7 @@
         <w:drawing>
           <wp:inline distT="0" distB="0" distL="0" distR="0">
             <wp:extent cx="5350000" cy="1819000"/>
-            <wp:docPr id="104" name="Study figure 4"/>
+            <wp:docPr id="105" name="Study figure 5"/>
             <wp:cNvGraphicFramePr/>
             <a:graphic>
               <a:graphicData uri="http://schemas.openxmlformats.org/drawingml/2006/picture">
@@ -3674,7 +3738,7 @@
                     <pic:cNvPicPr/>
                   </pic:nvPicPr>
                   <pic:blipFill>
-                    <a:blip r:embed="rIdStudy4"/>
+                    <a:blip r:embed="rIdStudy5"/>
                     <a:stretch>
                       <a:fillRect/>
                     </a:stretch>
@@ -3704,7 +3768,7 @@
         <w:rPr>
           <w:sz w:val="20"/>
         </w:rPr>
-        <w:t xml:space="preserve">Figure 4. The September 22 comparison of both exact pipelines. Values above 1 mean faster lookup than the set alone. Error bars show 95% intervals across four seed ratios.</w:t>
+        <w:t xml:space="preserve">Figure 5. The September 22 comparison of both exact pipelines. Values above 1 mean faster lookup than the set alone. Error bars show 95% intervals across four seed ratios.</w:t>
       </w:r>
     </w:p>
     <w:p>

</xml_diff>

<commit_message>
Make storage comparison a paragraph lead-in
</commit_message>
<xml_diff>
--- a/docs/Bloom_Filter_Report.docx
+++ b/docs/Bloom_Filter_Report.docx
@@ -2825,14 +2825,17 @@
     </w:p>
     <w:p>
       <w:pPr>
-        <w:pStyle w:val="Heading2"/>
+        <w:pStyle w:val="Normal"/>
         <w:numPr>
           <w:numId w:val="0"/>
         </w:numPr>
         <w:ind w:left="0" w:hanging="0"/>
       </w:pPr>
       <w:r>
-        <w:t xml:space="preserve">Storage comparison</w:t>
+        <w:t xml:space="preserve">Storage comparison:</w:t>
+        <w:rPr>
+          <w:b/>
+        </w:rPr>
       </w:r>
     </w:p>
     <w:tbl>

</xml_diff>

<commit_message>
Explain interpretation model before equations
</commit_message>
<xml_diff>
--- a/docs/Bloom_Filter_Report.docx
+++ b/docs/Bloom_Filter_Report.docx
@@ -4173,7 +4173,7 @@
         <w:pStyle w:val="Normal"/>
       </w:pPr>
       <w:r>
-        <w:t xml:space="preserve">Let q be the fraction of queries for absent keys and p the false-positive rate. The fraction r that reaches the exact set is approximately:</w:t>
+        <w:t xml:space="preserve">The experiments show that a Bloom filter helps only when it prevents enough exact-set lookups to repay its own checking cost. To make that trade-off explicit, let q be the fraction of queries for absent keys and p the false-positive rate. The fraction r that still reaches the exact set is approximately:</w:t>
       </w:r>
     </w:p>
     <w:p>
@@ -4195,7 +4195,7 @@
         <w:pStyle w:val="Normal"/>
       </w:pPr>
       <w:r>
-        <w:t xml:space="preserve">All present keys and the false positives require a set lookup. Let L be an extra cost per set lookup, and let T denote average time per input query. The subscripts identify set-only lookup and Bloom followed by the set. Using the measured times at L = 0:</w:t>
+        <w:t xml:space="preserve">All present keys and false positives still require a set lookup, while true negatives are rejected by the filter. Let L be the extra cost of one exact-set lookup, and let T denote average time per input query. The subscripts identify set-only lookup and Bloom followed by the set. Adding rL to the filtered pipeline gives the cost model below:</w:t>
       </w:r>
     </w:p>
     <w:p>

</xml_diff>

<commit_message>
Rewrite What I learned section
</commit_message>
<xml_diff>
--- a/docs/Bloom_Filter_Report.docx
+++ b/docs/Bloom_Filter_Report.docx
@@ -4795,7 +4795,7 @@
         <w:pStyle w:val="Normal"/>
       </w:pPr>
       <w:r>
-        <w:t xml:space="preserve">I learned to separate low error from fast exact lookup. Seven hashes gave 0.821% false positives, compared with 9.502% for one hash. However, with 200,000 keys and all queries absent, the one-hash exact pipeline was about 2.71 times as fast as the set alone. The original seven-hash early-exit version showed no clear speed advantage. Extra filtering is useful only when the lookups it avoids save enough time to pay for it.</w:t>
+        <w:t xml:space="preserve">I used to think that adding a Bloom filter would usually speed up an exact lookup. That was too simple. With k = 1 and 200,000 keys, the speedup was only 0.947 when half of the queries were absent, so the filter made the lookup slightly slower. Once the absent-query proportion increased to 90%, the speedup became 1.557, and it reached 2.709 when every query was absent. The filter helped because it could reject enough missing keys before they reached the exact set. This also explains why the number of hashes matters: using more hashes can reduce false positives, but it also makes every query more expensive.</w:t>
       </w:r>
     </w:p>
     <w:p>
@@ -4815,7 +4815,7 @@
         <w:pStyle w:val="Normal"/>
       </w:pPr>
       <w:r>
-        <w:t xml:space="preserve">The early-exit result showed why counting operations is not enough to predict runtime. It checked about two bits on average, yet checking all seven was faster. The later exact-pipeline test also showed that full scanning helped when all queries were absent but lost to early exit when half were absent. This makes workload testing necessary; the code with fewer checks is not automatically the faster choice.</w:t>
+        <w:t xml:space="preserve">At first, early exit seemed obviously better. It stops at the first zero bit, and in the experiment it checked about two positions per absent query instead of all seven. Surprisingly, full scanning was faster when all queries were absent. I had been treating the number of checks as if it directly represented running time. The experiment changed that view. Branches, compiler output and hardware effects can matter as much as the number of logical operations, so the complete workload still needs to be measured.</w:t>
       </w:r>
     </w:p>
     <w:p>
@@ -4835,7 +4835,7 @@
         <w:pStyle w:val="Normal"/>
       </w:pPr>
       <w:r>
-        <w:t xml:space="preserve">I also learned that a correct filter can become less useful. At three times its design capacity, it still had no false negatives, but about 40% of absent queries passed through. Correctness tests need to check that inserted keys are never rejected. Performance tests also need to check whether the error rate is acceptable at the intended capacity.</w:t>
+        <w:t xml:space="preserve">I was initially worried that putting too many keys into the filter could make an inserted key fail a query. That did not happen. Even at three times the design capacity, the filter still had no false negatives. What changed was its ability to reject absent keys: the false-positive rate rose to 40.182%. The filter was still correct, but it was no longer very effective. This taught me that the expected number of keys should be estimated before choosing the size of the filter, with room left for future growth.</w:t>
       </w:r>
     </w:p>
     <w:p>

</xml_diff>